<commit_message>
TERCER COMMIT - PRIMERA VERSION FUNCIONAL
</commit_message>
<xml_diff>
--- a/LEO_ASTRAY_VILLANUEVA/FicherosExamenDATAJPA/ExamenDataJpa.docx
+++ b/LEO_ASTRAY_VILLANUEVA/FicherosExamenDATAJPA/ExamenDataJpa.docx
@@ -92,6 +92,12 @@
         </w:rPr>
         <w:t xml:space="preserve"> que detalla su historial administrativo, y cada expediente pertenece exclusivamente a un estudiante. </w:t>
       </w:r>
+      <w:r>
+        <w:rPr>
+          <w:rFonts w:cs="Arial" w:ascii="Arial" w:hAnsi="Arial"/>
+        </w:rPr>
+        <w:t>TERMINADA</w:t>
+      </w:r>
     </w:p>
     <w:p>
       <w:pPr>
@@ -205,7 +211,13 @@
         <w:rPr>
           <w:rFonts w:cs="Arial" w:ascii="Arial" w:hAnsi="Arial"/>
         </w:rPr>
-        <w:t>.</w:t>
+        <w:t xml:space="preserve">. </w:t>
+      </w:r>
+      <w:r>
+        <w:rPr>
+          <w:rFonts w:cs="Arial" w:ascii="Arial" w:hAnsi="Arial"/>
+        </w:rPr>
+        <w:t>TERMINADA</w:t>
       </w:r>
     </w:p>
     <w:p>
@@ -1851,7 +1863,15 @@
           <w:b/>
           <w:bCs/>
         </w:rPr>
-        <w:t>Bloque 1 (Métodos base de JpaRepository):</w:t>
+        <w:t xml:space="preserve">Bloque 1 (Métodos base de JpaRepository): </w:t>
+      </w:r>
+      <w:r>
+        <w:rPr>
+          <w:rFonts w:cs="Arial" w:ascii="Arial" w:hAnsi="Arial"/>
+          <w:b/>
+          <w:bCs/>
+        </w:rPr>
+        <w:t>TERMINADO</w:t>
       </w:r>
     </w:p>
     <w:p>
@@ -1903,7 +1923,14 @@
           <w:rFonts w:cs="Arial" w:ascii="Arial" w:hAnsi="Arial"/>
           <w:color w:val="EE0000"/>
         </w:rPr>
-        <w:t>(1 punto)</w:t>
+        <w:t xml:space="preserve">(1 punto) </w:t>
+      </w:r>
+      <w:r>
+        <w:rPr>
+          <w:rFonts w:cs="Arial" w:ascii="Arial" w:hAnsi="Arial"/>
+          <w:color w:val="EE0000"/>
+        </w:rPr>
+        <w:t>TERMINADO</w:t>
       </w:r>
     </w:p>
     <w:p>
@@ -1998,7 +2025,16 @@
           <w:bCs/>
           <w:color w:val="EE0000"/>
         </w:rPr>
-        <w:t>(1 punto)</w:t>
+        <w:t xml:space="preserve">(1 punto) </w:t>
+      </w:r>
+      <w:r>
+        <w:rPr>
+          <w:rFonts w:cs="Arial" w:ascii="Arial" w:hAnsi="Arial"/>
+          <w:b/>
+          <w:bCs/>
+          <w:color w:val="EE0000"/>
+        </w:rPr>
+        <w:t>TERMINADO</w:t>
       </w:r>
     </w:p>
     <w:p>

</xml_diff>

<commit_message>
CUARTO COMMIT - EXAMEN TERMINADO A FALTA DE REVISARLO
</commit_message>
<xml_diff>
--- a/LEO_ASTRAY_VILLANUEVA/FicherosExamenDATAJPA/ExamenDataJpa.docx
+++ b/LEO_ASTRAY_VILLANUEVA/FicherosExamenDATAJPA/ExamenDataJpa.docx
@@ -90,13 +90,7 @@
         <w:rPr>
           <w:rFonts w:cs="Arial" w:ascii="Arial" w:hAnsi="Arial"/>
         </w:rPr>
-        <w:t xml:space="preserve"> que detalla su historial administrativo, y cada expediente pertenece exclusivamente a un estudiante. </w:t>
-      </w:r>
-      <w:r>
-        <w:rPr>
-          <w:rFonts w:cs="Arial" w:ascii="Arial" w:hAnsi="Arial"/>
-        </w:rPr>
-        <w:t>TERMINADA</w:t>
+        <w:t xml:space="preserve"> que detalla su historial administrativo, y cada expediente pertenece exclusivamente a un estudiante. TERMINADA</w:t>
       </w:r>
     </w:p>
     <w:p>
@@ -211,13 +205,7 @@
         <w:rPr>
           <w:rFonts w:cs="Arial" w:ascii="Arial" w:hAnsi="Arial"/>
         </w:rPr>
-        <w:t xml:space="preserve">. </w:t>
-      </w:r>
-      <w:r>
-        <w:rPr>
-          <w:rFonts w:cs="Arial" w:ascii="Arial" w:hAnsi="Arial"/>
-        </w:rPr>
-        <w:t>TERMINADA</w:t>
+        <w:t>. TERMINADA</w:t>
       </w:r>
     </w:p>
     <w:p>
@@ -1863,15 +1851,7 @@
           <w:b/>
           <w:bCs/>
         </w:rPr>
-        <w:t xml:space="preserve">Bloque 1 (Métodos base de JpaRepository): </w:t>
-      </w:r>
-      <w:r>
-        <w:rPr>
-          <w:rFonts w:cs="Arial" w:ascii="Arial" w:hAnsi="Arial"/>
-          <w:b/>
-          <w:bCs/>
-        </w:rPr>
-        <w:t>TERMINADO</w:t>
+        <w:t>Bloque 1 (Métodos base de JpaRepository): TERMINADO</w:t>
       </w:r>
     </w:p>
     <w:p>
@@ -1923,14 +1903,7 @@
           <w:rFonts w:cs="Arial" w:ascii="Arial" w:hAnsi="Arial"/>
           <w:color w:val="EE0000"/>
         </w:rPr>
-        <w:t xml:space="preserve">(1 punto) </w:t>
-      </w:r>
-      <w:r>
-        <w:rPr>
-          <w:rFonts w:cs="Arial" w:ascii="Arial" w:hAnsi="Arial"/>
-          <w:color w:val="EE0000"/>
-        </w:rPr>
-        <w:t>TERMINADO</w:t>
+        <w:t>(1 punto) TERMINADO</w:t>
       </w:r>
     </w:p>
     <w:p>
@@ -2025,16 +1998,7 @@
           <w:bCs/>
           <w:color w:val="EE0000"/>
         </w:rPr>
-        <w:t xml:space="preserve">(1 punto) </w:t>
-      </w:r>
-      <w:r>
-        <w:rPr>
-          <w:rFonts w:cs="Arial" w:ascii="Arial" w:hAnsi="Arial"/>
-          <w:b/>
-          <w:bCs/>
-          <w:color w:val="EE0000"/>
-        </w:rPr>
-        <w:t>TERMINADO</w:t>
+        <w:t>(1 punto) TERMINADO</w:t>
       </w:r>
     </w:p>
     <w:p>
@@ -2096,7 +2060,15 @@
           <w:b/>
           <w:bCs/>
         </w:rPr>
-        <w:t>(1 punto)</w:t>
+        <w:t xml:space="preserve">(1 punto) </w:t>
+      </w:r>
+      <w:r>
+        <w:rPr>
+          <w:rFonts w:cs="Arial" w:ascii="Arial" w:hAnsi="Arial"/>
+          <w:b/>
+          <w:bCs/>
+        </w:rPr>
+        <w:t>TERMINADO</w:t>
       </w:r>
     </w:p>
     <w:p>
@@ -2152,7 +2124,16 @@
           <w:bCs/>
           <w:color w:val="EE0000"/>
         </w:rPr>
-        <w:t>(1 punto)</w:t>
+        <w:t xml:space="preserve">(1 punto) </w:t>
+      </w:r>
+      <w:r>
+        <w:rPr>
+          <w:rFonts w:cs="Arial" w:ascii="Arial" w:hAnsi="Arial"/>
+          <w:b/>
+          <w:bCs/>
+          <w:color w:val="EE0000"/>
+        </w:rPr>
+        <w:t>TERMINADO</w:t>
       </w:r>
     </w:p>
     <w:p>
@@ -2194,7 +2175,16 @@
           <w:bCs/>
           <w:color w:val="EE0000"/>
         </w:rPr>
-        <w:t>(0.5 puntos)</w:t>
+        <w:t xml:space="preserve">(0.5 puntos) </w:t>
+      </w:r>
+      <w:r>
+        <w:rPr>
+          <w:rFonts w:cs="Arial" w:ascii="Arial" w:hAnsi="Arial"/>
+          <w:b/>
+          <w:bCs/>
+          <w:color w:val="EE0000"/>
+        </w:rPr>
+        <w:t>TERMINADO</w:t>
       </w:r>
     </w:p>
     <w:p>
@@ -2209,6 +2199,7 @@
         <w:rPr>
           <w:rFonts w:cs="Arial" w:ascii="Arial" w:hAnsi="Arial"/>
         </w:rPr>
+        <w:t xml:space="preserve"> </w:t>
       </w:r>
     </w:p>
     <w:p>
@@ -2270,7 +2261,16 @@
           <w:bCs/>
           <w:color w:val="EE0000"/>
         </w:rPr>
-        <w:t>(0.5 puntos)</w:t>
+        <w:t xml:space="preserve">(0.5 puntos) </w:t>
+      </w:r>
+      <w:r>
+        <w:rPr>
+          <w:rFonts w:cs="Arial" w:ascii="Arial" w:hAnsi="Arial"/>
+          <w:b/>
+          <w:bCs/>
+          <w:color w:val="EE0000"/>
+        </w:rPr>
+        <w:t>TERMINADO</w:t>
       </w:r>
     </w:p>
     <w:p>

</xml_diff>